<commit_message>
Sync 2026-09-29 workout (Run: 漸快 11.09km) and update dashboard
</commit_message>
<xml_diff>
--- a/docs/weekly/2026-W40_當週執行率回顧報告.docx
+++ b/docs/weekly/2026-W40_當週執行率回顧報告.docx
@@ -21,7 +21,7 @@
           <w:color w:val="555555"/>
           <w:sz w:val="20"/>
         </w:rPr>
-        <w:t>週期：2026/09/28–2026/10/04　｜　整體時間執行率：0.0%</w:t>
+        <w:t>週期：2026/09/28–2026/10/04　｜　整體時間執行率：8.6%</w:t>
       </w:r>
     </w:p>
     <w:p>
@@ -783,7 +783,7 @@
                 <w:color w:val="000000"/>
                 <w:sz w:val="19"/>
               </w:rPr>
-              <w:t>0.00 hr</w:t>
+              <w:t>1.23 hr</w:t>
             </w:r>
           </w:p>
         </w:tc>
@@ -810,7 +810,7 @@
                 <w:color w:val="000000"/>
                 <w:sz w:val="19"/>
               </w:rPr>
-              <w:t>0.0%</w:t>
+              <w:t>28.5%</w:t>
             </w:r>
           </w:p>
         </w:tc>
@@ -864,7 +864,7 @@
                 <w:color w:val="000000"/>
                 <w:sz w:val="19"/>
               </w:rPr>
-              <w:t>0.00 km</w:t>
+              <w:t>11.09 km</w:t>
             </w:r>
           </w:p>
         </w:tc>
@@ -891,7 +891,7 @@
                 <w:color w:val="000000"/>
                 <w:sz w:val="19"/>
               </w:rPr>
-              <w:t>0.0%</w:t>
+              <w:t>26.0%</w:t>
             </w:r>
           </w:p>
         </w:tc>
@@ -1550,7 +1550,7 @@
                 <w:color w:val="000000"/>
                 <w:sz w:val="19"/>
               </w:rPr>
-              <w:t>Bike: VO2 Max 2X8</w:t>
+              <w:t>Bike: VO2 Max 2X6</w:t>
             </w:r>
           </w:p>
         </w:tc>
@@ -1797,7 +1797,7 @@
                 <w:color w:val="000000"/>
                 <w:sz w:val="19"/>
               </w:rPr>
-              <w:t>0分</w:t>
+              <w:t>74分 / 11.09km</w:t>
             </w:r>
           </w:p>
         </w:tc>
@@ -1824,7 +1824,7 @@
                 <w:color w:val="000000"/>
                 <w:sz w:val="19"/>
               </w:rPr>
-              <w:t>❌ 未執行/待排程</w:t>
+              <w:t>🟢 良好達標 (92%, A-)</w:t>
             </w:r>
           </w:p>
         </w:tc>
@@ -3345,7 +3345,7 @@
     </w:p>
     <w:p>
       <w:r>
-        <w:t>• 當週累積自行車 0.00 km、跑步 0.00 km、游泳 0.00 km，整體時間執行率達 0.0%。</w:t>
+        <w:t>• 當週累積自行車 0.00 km、跑步 11.09 km、游泳 0.00 km，整體時間執行率達 8.6%。</w:t>
         <w:br/>
       </w:r>
       <w:r>

</xml_diff>

<commit_message>
Auto Daily 8:00 PM Dashboard Update [2026-09-29 20:00]
</commit_message>
<xml_diff>
--- a/docs/weekly/2026-W40_當週執行率回顧報告.docx
+++ b/docs/weekly/2026-W40_當週執行率回顧報告.docx
@@ -21,7 +21,7 @@
           <w:color w:val="555555"/>
           <w:sz w:val="20"/>
         </w:rPr>
-        <w:t>週期：2026/09/28–2026/10/04　｜　整體時間執行率：8.6%</w:t>
+        <w:t>週期：2026/09/28–2026/10/04　｜　整體時間執行率：13.2%</w:t>
       </w:r>
     </w:p>
     <w:p>
@@ -565,7 +565,7 @@
                 <w:color w:val="000000"/>
                 <w:sz w:val="19"/>
               </w:rPr>
-              <w:t>0.00 hr</w:t>
+              <w:t>0.67 hr</w:t>
             </w:r>
           </w:p>
         </w:tc>
@@ -592,7 +592,7 @@
                 <w:color w:val="000000"/>
                 <w:sz w:val="19"/>
               </w:rPr>
-              <w:t>0.0%</w:t>
+              <w:t>9.8%</w:t>
             </w:r>
           </w:p>
         </w:tc>
@@ -646,7 +646,7 @@
                 <w:color w:val="000000"/>
                 <w:sz w:val="19"/>
               </w:rPr>
-              <w:t>0.00 km</w:t>
+              <w:t>18.98 km</w:t>
             </w:r>
           </w:p>
         </w:tc>
@@ -673,7 +673,7 @@
                 <w:color w:val="000000"/>
                 <w:sz w:val="19"/>
               </w:rPr>
-              <w:t>0.0%</w:t>
+              <w:t>16.1%</w:t>
             </w:r>
           </w:p>
         </w:tc>
@@ -1631,7 +1631,7 @@
                 <w:color w:val="000000"/>
                 <w:sz w:val="19"/>
               </w:rPr>
-              <w:t>0分</w:t>
+              <w:t>40分 / 18.98km</w:t>
             </w:r>
           </w:p>
         </w:tc>
@@ -1658,7 +1658,7 @@
                 <w:color w:val="000000"/>
                 <w:sz w:val="19"/>
               </w:rPr>
-              <w:t>❌ 未執行/待排程</w:t>
+              <w:t>✅ 精準達標 (100%, A+)</w:t>
             </w:r>
           </w:p>
         </w:tc>
@@ -3345,7 +3345,7 @@
     </w:p>
     <w:p>
       <w:r>
-        <w:t>• 當週累積自行車 0.00 km、跑步 11.09 km、游泳 0.00 km，整體時間執行率達 8.6%。</w:t>
+        <w:t>• 當週累積自行車 18.98 km、跑步 11.09 km、游泳 0.00 km，整體時間執行率達 13.2%。</w:t>
         <w:br/>
       </w:r>
       <w:r>

</xml_diff>

<commit_message>
Auto Daily 8:00 PM Dashboard Update [2026-09-30 20:00]
</commit_message>
<xml_diff>
--- a/docs/weekly/2026-W40_當週執行率回顧報告.docx
+++ b/docs/weekly/2026-W40_當週執行率回顧報告.docx
@@ -21,7 +21,7 @@
           <w:color w:val="555555"/>
           <w:sz w:val="20"/>
         </w:rPr>
-        <w:t>週期：2026/09/28–2026/10/04　｜　整體時間執行率：13.2%</w:t>
+        <w:t>週期：2026/09/28–2026/10/04　｜　整體時間執行率：25.9%</w:t>
       </w:r>
     </w:p>
     <w:p>
@@ -347,7 +347,7 @@
                 <w:color w:val="000000"/>
                 <w:sz w:val="19"/>
               </w:rPr>
-              <w:t>0.00 hr</w:t>
+              <w:t>1.08 hr</w:t>
             </w:r>
           </w:p>
         </w:tc>
@@ -374,7 +374,7 @@
                 <w:color w:val="000000"/>
                 <w:sz w:val="19"/>
               </w:rPr>
-              <w:t>0.0%</w:t>
+              <w:t>33.3%</w:t>
             </w:r>
           </w:p>
         </w:tc>
@@ -428,7 +428,7 @@
                 <w:color w:val="000000"/>
                 <w:sz w:val="19"/>
               </w:rPr>
-              <w:t>0.00 km</w:t>
+              <w:t>3.40 km</w:t>
             </w:r>
           </w:p>
         </w:tc>
@@ -455,7 +455,7 @@
                 <w:color w:val="000000"/>
                 <w:sz w:val="19"/>
               </w:rPr>
-              <w:t>0.0%</w:t>
+              <w:t>147.8%</w:t>
             </w:r>
           </w:p>
         </w:tc>
@@ -565,7 +565,7 @@
                 <w:color w:val="000000"/>
                 <w:sz w:val="19"/>
               </w:rPr>
-              <w:t>0.67 hr</w:t>
+              <w:t>1.42 hr</w:t>
             </w:r>
           </w:p>
         </w:tc>
@@ -592,7 +592,7 @@
                 <w:color w:val="000000"/>
                 <w:sz w:val="19"/>
               </w:rPr>
-              <w:t>9.8%</w:t>
+              <w:t>20.7%</w:t>
             </w:r>
           </w:p>
         </w:tc>
@@ -646,7 +646,7 @@
                 <w:color w:val="000000"/>
                 <w:sz w:val="19"/>
               </w:rPr>
-              <w:t>18.98 km</w:t>
+              <w:t>37.97 km</w:t>
             </w:r>
           </w:p>
         </w:tc>
@@ -673,7 +673,7 @@
                 <w:color w:val="000000"/>
                 <w:sz w:val="19"/>
               </w:rPr>
-              <w:t>16.1%</w:t>
+              <w:t>32.2%</w:t>
             </w:r>
           </w:p>
         </w:tc>
@@ -1963,7 +1963,7 @@
                 <w:color w:val="000000"/>
                 <w:sz w:val="19"/>
               </w:rPr>
-              <w:t>0分</w:t>
+              <w:t>45分 / 18.99km</w:t>
             </w:r>
           </w:p>
         </w:tc>
@@ -1990,7 +1990,7 @@
                 <w:color w:val="000000"/>
                 <w:sz w:val="19"/>
               </w:rPr>
-              <w:t>❌ 未執行/待排程</w:t>
+              <w:t>✅ 精準達標 (100%, A+)</w:t>
             </w:r>
           </w:p>
         </w:tc>
@@ -2129,7 +2129,7 @@
                 <w:color w:val="000000"/>
                 <w:sz w:val="19"/>
               </w:rPr>
-              <w:t>0分</w:t>
+              <w:t>65分 / 3.40km</w:t>
             </w:r>
           </w:p>
         </w:tc>
@@ -2156,7 +2156,7 @@
                 <w:color w:val="000000"/>
                 <w:sz w:val="19"/>
               </w:rPr>
-              <w:t>❌ 未執行/待排程</w:t>
+              <w:t>🟢 良好達標 (87%, A-)</w:t>
             </w:r>
           </w:p>
         </w:tc>
@@ -3345,7 +3345,7 @@
     </w:p>
     <w:p>
       <w:r>
-        <w:t>• 當週累積自行車 18.98 km、跑步 11.09 km、游泳 0.00 km，整體時間執行率達 13.2%。</w:t>
+        <w:t>• 當週累積自行車 37.97 km、跑步 11.09 km、游泳 3.40 km，整體時間執行率達 25.9%。</w:t>
         <w:br/>
       </w:r>
       <w:r>

</xml_diff>

<commit_message>
Auto Daily 8:00 PM Dashboard Update [2026-10-01 20:00]
</commit_message>
<xml_diff>
--- a/docs/weekly/2026-W40_當週執行率回顧報告.docx
+++ b/docs/weekly/2026-W40_當週執行率回顧報告.docx
@@ -21,7 +21,7 @@
           <w:color w:val="555555"/>
           <w:sz w:val="20"/>
         </w:rPr>
-        <w:t>週期：2026/09/28–2026/10/04　｜　整體時間執行率：25.9%</w:t>
+        <w:t>週期：2026/09/28–2026/10/04　｜　整體時間執行率：39.2%</w:t>
       </w:r>
     </w:p>
     <w:p>
@@ -565,7 +565,7 @@
                 <w:color w:val="000000"/>
                 <w:sz w:val="19"/>
               </w:rPr>
-              <w:t>1.42 hr</w:t>
+              <w:t>2.83 hr</w:t>
             </w:r>
           </w:p>
         </w:tc>
@@ -592,7 +592,7 @@
                 <w:color w:val="000000"/>
                 <w:sz w:val="19"/>
               </w:rPr>
-              <w:t>20.7%</w:t>
+              <w:t>41.5%</w:t>
             </w:r>
           </w:p>
         </w:tc>
@@ -646,7 +646,7 @@
                 <w:color w:val="000000"/>
                 <w:sz w:val="19"/>
               </w:rPr>
-              <w:t>37.97 km</w:t>
+              <w:t>81.15 km</w:t>
             </w:r>
           </w:p>
         </w:tc>
@@ -673,7 +673,7 @@
                 <w:color w:val="000000"/>
                 <w:sz w:val="19"/>
               </w:rPr>
-              <w:t>32.2%</w:t>
+              <w:t>68.8%</w:t>
             </w:r>
           </w:p>
         </w:tc>
@@ -783,7 +783,7 @@
                 <w:color w:val="000000"/>
                 <w:sz w:val="19"/>
               </w:rPr>
-              <w:t>1.23 hr</w:t>
+              <w:t>1.73 hr</w:t>
             </w:r>
           </w:p>
         </w:tc>
@@ -810,7 +810,7 @@
                 <w:color w:val="000000"/>
                 <w:sz w:val="19"/>
               </w:rPr>
-              <w:t>28.5%</w:t>
+              <w:t>40.0%</w:t>
             </w:r>
           </w:p>
         </w:tc>
@@ -864,7 +864,7 @@
                 <w:color w:val="000000"/>
                 <w:sz w:val="19"/>
               </w:rPr>
-              <w:t>11.09 km</w:t>
+              <w:t>16.31 km</w:t>
             </w:r>
           </w:p>
         </w:tc>
@@ -891,7 +891,7 @@
                 <w:color w:val="000000"/>
                 <w:sz w:val="19"/>
               </w:rPr>
-              <w:t>26.0%</w:t>
+              <w:t>38.3%</w:t>
             </w:r>
           </w:p>
         </w:tc>
@@ -2295,7 +2295,7 @@
                 <w:color w:val="000000"/>
                 <w:sz w:val="19"/>
               </w:rPr>
-              <w:t>0分</w:t>
+              <w:t>85分 / 43.18km</w:t>
             </w:r>
           </w:p>
         </w:tc>
@@ -2322,7 +2322,7 @@
                 <w:color w:val="000000"/>
                 <w:sz w:val="19"/>
               </w:rPr>
-              <w:t>❌ 未執行/待排程</w:t>
+              <w:t>✅ 精準達標 (100%, A+)</w:t>
             </w:r>
           </w:p>
         </w:tc>
@@ -2461,7 +2461,7 @@
                 <w:color w:val="000000"/>
                 <w:sz w:val="19"/>
               </w:rPr>
-              <w:t>0分</w:t>
+              <w:t>30分 / 5.22km</w:t>
             </w:r>
           </w:p>
         </w:tc>
@@ -2488,7 +2488,7 @@
                 <w:color w:val="000000"/>
                 <w:sz w:val="19"/>
               </w:rPr>
-              <w:t>❌ 未執行/待排程</w:t>
+              <w:t>✅ 精準達標 (100%, A+)</w:t>
             </w:r>
           </w:p>
         </w:tc>
@@ -3345,7 +3345,7 @@
     </w:p>
     <w:p>
       <w:r>
-        <w:t>• 當週累積自行車 37.97 km、跑步 11.09 km、游泳 3.40 km，整體時間執行率達 25.9%。</w:t>
+        <w:t>• 當週累積自行車 81.15 km、跑步 16.31 km、游泳 3.40 km，整體時間執行率達 39.2%。</w:t>
         <w:br/>
       </w:r>
       <w:r>

</xml_diff>

<commit_message>
Auto Daily 8:00 PM Dashboard Update [2026-10-02 20:00]
</commit_message>
<xml_diff>
--- a/docs/weekly/2026-W40_當週執行率回顧報告.docx
+++ b/docs/weekly/2026-W40_當週執行率回顧報告.docx
@@ -21,7 +21,7 @@
           <w:color w:val="555555"/>
           <w:sz w:val="20"/>
         </w:rPr>
-        <w:t>週期：2026/09/28–2026/10/04　｜　整體時間執行率：39.2%</w:t>
+        <w:t>週期：2026/09/28–2026/10/04　｜　整體時間執行率：46.8%</w:t>
       </w:r>
     </w:p>
     <w:p>
@@ -347,7 +347,7 @@
                 <w:color w:val="000000"/>
                 <w:sz w:val="19"/>
               </w:rPr>
-              <w:t>1.08 hr</w:t>
+              <w:t>2.18 hr</w:t>
             </w:r>
           </w:p>
         </w:tc>
@@ -374,7 +374,7 @@
                 <w:color w:val="000000"/>
                 <w:sz w:val="19"/>
               </w:rPr>
-              <w:t>33.3%</w:t>
+              <w:t>67.2%</w:t>
             </w:r>
           </w:p>
         </w:tc>
@@ -428,7 +428,7 @@
                 <w:color w:val="000000"/>
                 <w:sz w:val="19"/>
               </w:rPr>
-              <w:t>3.40 km</w:t>
+              <w:t>6.70 km</w:t>
             </w:r>
           </w:p>
         </w:tc>
@@ -455,7 +455,7 @@
                 <w:color w:val="000000"/>
                 <w:sz w:val="19"/>
               </w:rPr>
-              <w:t>147.8%</w:t>
+              <w:t>291.3%</w:t>
             </w:r>
           </w:p>
         </w:tc>
@@ -2627,7 +2627,7 @@
                 <w:color w:val="000000"/>
                 <w:sz w:val="19"/>
               </w:rPr>
-              <w:t>0分</w:t>
+              <w:t>66分 / 3.30km</w:t>
             </w:r>
           </w:p>
         </w:tc>
@@ -2654,7 +2654,7 @@
                 <w:color w:val="000000"/>
                 <w:sz w:val="19"/>
               </w:rPr>
-              <w:t>❌ 未執行/待排程</w:t>
+              <w:t>🟢 良好達標 (88%, A-)</w:t>
             </w:r>
           </w:p>
         </w:tc>
@@ -3345,7 +3345,7 @@
     </w:p>
     <w:p>
       <w:r>
-        <w:t>• 當週累積自行車 81.15 km、跑步 16.31 km、游泳 3.40 km，整體時間執行率達 39.2%。</w:t>
+        <w:t>• 當週累積自行車 81.15 km、跑步 16.31 km、游泳 6.70 km，整體時間執行率達 46.8%。</w:t>
         <w:br/>
       </w:r>
       <w:r>

</xml_diff>

<commit_message>
Auto Daily 8:00 PM Dashboard Update [2026-10-04 08:48]
</commit_message>
<xml_diff>
--- a/docs/weekly/2026-W40_當週執行率回顧報告.docx
+++ b/docs/weekly/2026-W40_當週執行率回顧報告.docx
@@ -21,7 +21,7 @@
           <w:color w:val="555555"/>
           <w:sz w:val="20"/>
         </w:rPr>
-        <w:t>週期：2026/09/28–2026/10/04　｜　整體時間執行率：46.8%</w:t>
+        <w:t>週期：2026/09/28–2026/10/04　｜　整體時間執行率：71.1%</w:t>
       </w:r>
     </w:p>
     <w:p>
@@ -538,7 +538,7 @@
                 <w:color w:val="000000"/>
                 <w:sz w:val="19"/>
               </w:rPr>
-              <w:t>6.83 hr</w:t>
+              <w:t>9.42 hr</w:t>
             </w:r>
           </w:p>
         </w:tc>
@@ -565,7 +565,7 @@
                 <w:color w:val="000000"/>
                 <w:sz w:val="19"/>
               </w:rPr>
-              <w:t>2.83 hr</w:t>
+              <w:t>7.17 hr</w:t>
             </w:r>
           </w:p>
         </w:tc>
@@ -592,7 +592,7 @@
                 <w:color w:val="000000"/>
                 <w:sz w:val="19"/>
               </w:rPr>
-              <w:t>41.5%</w:t>
+              <w:t>76.1%</w:t>
             </w:r>
           </w:p>
         </w:tc>
@@ -646,7 +646,7 @@
                 <w:color w:val="000000"/>
                 <w:sz w:val="19"/>
               </w:rPr>
-              <w:t>81.15 km</w:t>
+              <w:t>197.25 km</w:t>
             </w:r>
           </w:p>
         </w:tc>
@@ -673,7 +673,7 @@
                 <w:color w:val="000000"/>
                 <w:sz w:val="19"/>
               </w:rPr>
-              <w:t>68.8%</w:t>
+              <w:t>167.2%</w:t>
             </w:r>
           </w:p>
         </w:tc>
@@ -700,7 +700,7 @@
                 <w:color w:val="000000"/>
                 <w:sz w:val="19"/>
               </w:rPr>
-              <w:t>4</w:t>
+              <w:t>5</w:t>
             </w:r>
           </w:p>
         </w:tc>
@@ -783,7 +783,7 @@
                 <w:color w:val="000000"/>
                 <w:sz w:val="19"/>
               </w:rPr>
-              <w:t>1.73 hr</w:t>
+              <w:t>2.73 hr</w:t>
             </w:r>
           </w:p>
         </w:tc>
@@ -810,7 +810,7 @@
                 <w:color w:val="000000"/>
                 <w:sz w:val="19"/>
               </w:rPr>
-              <w:t>40.0%</w:t>
+              <w:t>63.1%</w:t>
             </w:r>
           </w:p>
         </w:tc>
@@ -864,7 +864,7 @@
                 <w:color w:val="000000"/>
                 <w:sz w:val="19"/>
               </w:rPr>
-              <w:t>16.31 km</w:t>
+              <w:t>26.15 km</w:t>
             </w:r>
           </w:p>
         </w:tc>
@@ -891,7 +891,7 @@
                 <w:color w:val="000000"/>
                 <w:sz w:val="19"/>
               </w:rPr>
-              <w:t>38.3%</w:t>
+              <w:t>61.4%</w:t>
             </w:r>
           </w:p>
         </w:tc>
@@ -2712,6 +2712,172 @@
                 <w:color w:val="000000"/>
                 <w:sz w:val="19"/>
               </w:rPr>
+              <w:t>Bike: TEMPO 140</w:t>
+            </w:r>
+          </w:p>
+        </w:tc>
+        <w:tc>
+          <w:tcPr>
+            <w:tcW w:type="dxa" w:w="1050"/>
+            <w:tcMar>
+              <w:top w:w="80" w:type="dxa"/>
+              <w:start w:w="120" w:type="dxa"/>
+              <w:bottom w:w="80" w:type="dxa"/>
+              <w:end w:w="120" w:type="dxa"/>
+            </w:tcMar>
+            <w:vAlign w:val="center"/>
+          </w:tcPr>
+          <w:p>
+            <w:pPr>
+              <w:spacing w:after="0"/>
+              <w:jc w:val="center"/>
+            </w:pPr>
+            <w:r>
+              <w:rPr>
+                <w:rFonts w:ascii="Calibri" w:hAnsi="Calibri" w:eastAsia="Microsoft JhengHei"/>
+                <w:b w:val="0"/>
+                <w:color w:val="000000"/>
+                <w:sz w:val="19"/>
+              </w:rPr>
+              <w:t>Bike</w:t>
+            </w:r>
+          </w:p>
+        </w:tc>
+        <w:tc>
+          <w:tcPr>
+            <w:tcW w:type="dxa" w:w="1500"/>
+            <w:tcMar>
+              <w:top w:w="80" w:type="dxa"/>
+              <w:start w:w="120" w:type="dxa"/>
+              <w:bottom w:w="80" w:type="dxa"/>
+              <w:end w:w="120" w:type="dxa"/>
+            </w:tcMar>
+            <w:vAlign w:val="center"/>
+          </w:tcPr>
+          <w:p>
+            <w:pPr>
+              <w:spacing w:after="0"/>
+              <w:jc w:val="center"/>
+            </w:pPr>
+            <w:r>
+              <w:rPr>
+                <w:rFonts w:ascii="Calibri" w:hAnsi="Calibri" w:eastAsia="Microsoft JhengHei"/>
+                <w:b w:val="0"/>
+                <w:color w:val="000000"/>
+                <w:sz w:val="19"/>
+              </w:rPr>
+              <w:t>155分</w:t>
+            </w:r>
+          </w:p>
+        </w:tc>
+        <w:tc>
+          <w:tcPr>
+            <w:tcW w:type="dxa" w:w="1500"/>
+            <w:tcMar>
+              <w:top w:w="80" w:type="dxa"/>
+              <w:start w:w="120" w:type="dxa"/>
+              <w:bottom w:w="80" w:type="dxa"/>
+              <w:end w:w="120" w:type="dxa"/>
+            </w:tcMar>
+            <w:vAlign w:val="center"/>
+          </w:tcPr>
+          <w:p>
+            <w:pPr>
+              <w:spacing w:after="0"/>
+              <w:jc w:val="center"/>
+            </w:pPr>
+            <w:r>
+              <w:rPr>
+                <w:rFonts w:ascii="Calibri" w:hAnsi="Calibri" w:eastAsia="Microsoft JhengHei"/>
+                <w:b w:val="0"/>
+                <w:color w:val="000000"/>
+                <w:sz w:val="19"/>
+              </w:rPr>
+              <w:t>0分</w:t>
+            </w:r>
+          </w:p>
+        </w:tc>
+        <w:tc>
+          <w:tcPr>
+            <w:tcW w:type="dxa" w:w="1810"/>
+            <w:tcMar>
+              <w:top w:w="80" w:type="dxa"/>
+              <w:start w:w="120" w:type="dxa"/>
+              <w:bottom w:w="80" w:type="dxa"/>
+              <w:end w:w="120" w:type="dxa"/>
+            </w:tcMar>
+            <w:vAlign w:val="center"/>
+          </w:tcPr>
+          <w:p>
+            <w:pPr>
+              <w:spacing w:after="0"/>
+              <w:jc w:val="center"/>
+            </w:pPr>
+            <w:r>
+              <w:rPr>
+                <w:rFonts w:ascii="Calibri" w:hAnsi="Calibri" w:eastAsia="Microsoft JhengHei"/>
+                <w:b w:val="0"/>
+                <w:color w:val="000000"/>
+                <w:sz w:val="19"/>
+              </w:rPr>
+              <w:t>❌ 未執行/待排程</w:t>
+            </w:r>
+          </w:p>
+        </w:tc>
+      </w:tr>
+      <w:tr>
+        <w:tc>
+          <w:tcPr>
+            <w:tcW w:type="dxa" w:w="1050"/>
+            <w:tcMar>
+              <w:top w:w="80" w:type="dxa"/>
+              <w:start w:w="120" w:type="dxa"/>
+              <w:bottom w:w="80" w:type="dxa"/>
+              <w:end w:w="120" w:type="dxa"/>
+            </w:tcMar>
+            <w:vAlign w:val="center"/>
+          </w:tcPr>
+          <w:p>
+            <w:pPr>
+              <w:spacing w:after="0"/>
+              <w:jc w:val="center"/>
+            </w:pPr>
+            <w:r>
+              <w:rPr>
+                <w:rFonts w:ascii="Calibri" w:hAnsi="Calibri" w:eastAsia="Microsoft JhengHei"/>
+                <w:b w:val="0"/>
+                <w:color w:val="000000"/>
+                <w:sz w:val="19"/>
+              </w:rPr>
+              <w:t>10/03</w:t>
+              <w:br/>
+              <w:t>週六</w:t>
+            </w:r>
+          </w:p>
+        </w:tc>
+        <w:tc>
+          <w:tcPr>
+            <w:tcW w:type="dxa" w:w="2750"/>
+            <w:tcMar>
+              <w:top w:w="80" w:type="dxa"/>
+              <w:start w:w="120" w:type="dxa"/>
+              <w:bottom w:w="80" w:type="dxa"/>
+              <w:end w:w="120" w:type="dxa"/>
+            </w:tcMar>
+            <w:vAlign w:val="center"/>
+          </w:tcPr>
+          <w:p>
+            <w:pPr>
+              <w:spacing w:after="0"/>
+              <w:jc w:val="left"/>
+            </w:pPr>
+            <w:r>
+              <w:rPr>
+                <w:rFonts w:ascii="Calibri" w:hAnsi="Calibri" w:eastAsia="Microsoft JhengHei"/>
+                <w:b w:val="0"/>
+                <w:color w:val="000000"/>
+                <w:sz w:val="19"/>
+              </w:rPr>
               <w:t>Bike: 北海岸（回程：石門全家休息）</w:t>
             </w:r>
           </w:p>
@@ -2793,7 +2959,7 @@
                 <w:color w:val="000000"/>
                 <w:sz w:val="19"/>
               </w:rPr>
-              <w:t>0分</w:t>
+              <w:t>260分 / 116.10km</w:t>
             </w:r>
           </w:p>
         </w:tc>
@@ -2820,7 +2986,7 @@
                 <w:color w:val="000000"/>
                 <w:sz w:val="19"/>
               </w:rPr>
-              <w:t>❌ 未執行/待排程</w:t>
+              <w:t>⚡ 超額完成 (108%, A)</w:t>
             </w:r>
           </w:p>
         </w:tc>
@@ -2959,7 +3125,7 @@
                 <w:color w:val="000000"/>
                 <w:sz w:val="19"/>
               </w:rPr>
-              <w:t>0分</w:t>
+              <w:t>60分 / 9.84km</w:t>
             </w:r>
           </w:p>
         </w:tc>
@@ -2986,7 +3152,7 @@
                 <w:color w:val="000000"/>
                 <w:sz w:val="19"/>
               </w:rPr>
-              <w:t>❌ 未執行/待排程</w:t>
+              <w:t>✅ 精準達標 (100%, A+)</w:t>
             </w:r>
           </w:p>
         </w:tc>
@@ -3345,7 +3511,11 @@
     </w:p>
     <w:p>
       <w:r>
-        <w:t>• 當週累積自行車 81.15 km、跑步 16.31 km、游泳 6.70 km，整體時間執行率達 46.8%。</w:t>
+        <w:t>• 當週累積自行車 197.25 km、跑步 26.15 km、游泳 6.70 km，整體時間執行率達 71.1%。</w:t>
+        <w:br/>
+      </w:r>
+      <w:r>
+        <w:t>• 長距離單車扎實完成，左右踩踏發力極為平衡 (50.5% / 49.5%)，座艙穩定度高。</w:t>
         <w:br/>
       </w:r>
       <w:r>

</xml_diff>

<commit_message>
Auto update weekly execution report and 52-week dashboard
</commit_message>
<xml_diff>
--- a/docs/weekly/2026-W40_當週執行率回顧報告.docx
+++ b/docs/weekly/2026-W40_當週執行率回顧報告.docx
@@ -21,7 +21,7 @@
           <w:color w:val="555555"/>
           <w:sz w:val="20"/>
         </w:rPr>
-        <w:t>週期：2026/09/28–2026/10/04　｜　整體時間執行率：71.1%</w:t>
+        <w:t>週期：2026/09/28–2026/10/04　｜　整體時間執行率：83.6%</w:t>
       </w:r>
     </w:p>
     <w:p>
@@ -347,7 +347,7 @@
                 <w:color w:val="000000"/>
                 <w:sz w:val="19"/>
               </w:rPr>
-              <w:t>2.18 hr</w:t>
+              <w:t>2.82 hr</w:t>
             </w:r>
           </w:p>
         </w:tc>
@@ -374,7 +374,7 @@
                 <w:color w:val="000000"/>
                 <w:sz w:val="19"/>
               </w:rPr>
-              <w:t>67.2%</w:t>
+              <w:t>86.7%</w:t>
             </w:r>
           </w:p>
         </w:tc>
@@ -428,7 +428,7 @@
                 <w:color w:val="000000"/>
                 <w:sz w:val="19"/>
               </w:rPr>
-              <w:t>6.70 km</w:t>
+              <w:t>8.70 km</w:t>
             </w:r>
           </w:p>
         </w:tc>
@@ -455,7 +455,7 @@
                 <w:color w:val="000000"/>
                 <w:sz w:val="19"/>
               </w:rPr>
-              <w:t>291.3%</w:t>
+              <w:t>378.3%</w:t>
             </w:r>
           </w:p>
         </w:tc>
@@ -783,7 +783,7 @@
                 <w:color w:val="000000"/>
                 <w:sz w:val="19"/>
               </w:rPr>
-              <w:t>2.73 hr</w:t>
+              <w:t>4.23 hr</w:t>
             </w:r>
           </w:p>
         </w:tc>
@@ -810,7 +810,7 @@
                 <w:color w:val="000000"/>
                 <w:sz w:val="19"/>
               </w:rPr>
-              <w:t>63.1%</w:t>
+              <w:t>97.7%</w:t>
             </w:r>
           </w:p>
         </w:tc>
@@ -864,7 +864,7 @@
                 <w:color w:val="000000"/>
                 <w:sz w:val="19"/>
               </w:rPr>
-              <w:t>26.15 km</w:t>
+              <w:t>41.53 km</w:t>
             </w:r>
           </w:p>
         </w:tc>
@@ -891,7 +891,7 @@
                 <w:color w:val="000000"/>
                 <w:sz w:val="19"/>
               </w:rPr>
-              <w:t>61.4%</w:t>
+              <w:t>97.5%</w:t>
             </w:r>
           </w:p>
         </w:tc>
@@ -3291,7 +3291,7 @@
                 <w:color w:val="000000"/>
                 <w:sz w:val="19"/>
               </w:rPr>
-              <w:t>0分</w:t>
+              <w:t>90分 / 15.38km</w:t>
             </w:r>
           </w:p>
         </w:tc>
@@ -3318,7 +3318,7 @@
                 <w:color w:val="000000"/>
                 <w:sz w:val="19"/>
               </w:rPr>
-              <w:t>❌ 未執行/待排程</w:t>
+              <w:t>✅ 精準達標 (100%, A+)</w:t>
             </w:r>
           </w:p>
         </w:tc>
@@ -3457,7 +3457,7 @@
                 <w:color w:val="000000"/>
                 <w:sz w:val="19"/>
               </w:rPr>
-              <w:t>0分</w:t>
+              <w:t>38分 / 2.00km</w:t>
             </w:r>
           </w:p>
         </w:tc>
@@ -3484,7 +3484,7 @@
                 <w:color w:val="000000"/>
                 <w:sz w:val="19"/>
               </w:rPr>
-              <w:t>❌ 未執行/待排程</w:t>
+              <w:t>🟢 良好達標 (84%, A-)</w:t>
             </w:r>
           </w:p>
         </w:tc>
@@ -3511,11 +3511,19 @@
     </w:p>
     <w:p>
       <w:r>
-        <w:t>• 當週累積自行車 197.25 km、跑步 26.15 km、游泳 6.70 km，整體時間執行率達 71.1%。</w:t>
+        <w:t>• 當週累積自行車 197.25 km、跑步 41.53 km、游泳 8.70 km，整體時間執行率達 83.6%。</w:t>
         <w:br/>
       </w:r>
       <w:r>
         <w:t>• 長距離單車扎實完成，左右踩踏發力極為平衡 (50.5% / 49.5%)，座艙穩定度高。</w:t>
+        <w:br/>
+      </w:r>
+      <w:r>
+        <w:t>• 順利完成 17.52 km 長跑（總爬升 +327m），平路河濱漸速至 5:26/km，上坡穩健控心率並自覺補水折返，下坡迅速拉高步頻收尾。</w:t>
+        <w:br/>
+      </w:r>
+      <w:r>
+        <w:t>• 游泳實游 4,100m，雙組 1,600m 自由式持續游繳出 1:56~1:58/100m 高度一致均速與 140 bpm 穩定心率，水感極佳。</w:t>
         <w:br/>
       </w:r>
       <w:r>

</xml_diff>